<commit_message>
Update CV docx files with part-time availability wording
</commit_message>
<xml_diff>
--- a/cv/Keyur_Patel_CV_Christchurch.docx
+++ b/cv/Keyur_Patel_CV_Christchurch.docx
@@ -31,7 +31,7 @@
           <w:sz w:val="20"/>
           <w:szCs w:val="20"/>
         </w:rPr>
-        <w:t xml:space="preserve">Christchurch, New Zealand | 022 398 2998 | patelkeyur.2312005@gmail.com | github.com/patelkeyur231</w:t>
+        <w:t xml:space="preserve">Christchurch, New Zealand | 022 398 2998 | patelkeyur.2312005@gmail.com | github.com/patelkeyur231 | patelkeyur231.github.io/keyur-patel-portfolio</w:t>
       </w:r>
     </w:p>
     <w:p>
@@ -1364,7 +1364,7 @@
           <w:sz w:val="21"/>
           <w:szCs w:val="21"/>
         </w:rPr>
-        <w:t xml:space="preserve">Available now for part-time or volunteer work (up to 25 hours per week, in line with student visa conditions), and for a full-time internship placement from 25 February 2027. Open to full-time, part-time, volunteer or fixed-term arrangements.</w:t>
+        <w:t>Available now for part-time or volunteer work (20–25 hours per week, in line with student visa conditions), and for a full-time internship placement from 25 February 2027. Open to full-time, part-time, volunteer or fixed-term arrangements.</w:t>
       </w:r>
     </w:p>
     <w:p>

</xml_diff>

<commit_message>
Update CV docx files with Generative AI certification
</commit_message>
<xml_diff>
--- a/cv/Keyur_Patel_CV_Christchurch.docx
+++ b/cv/Keyur_Patel_CV_Christchurch.docx
@@ -21,7 +21,7 @@
     </w:p>
     <w:p>
       <w:pPr>
-        <w:spacing w:after="140"/>
+        <w:spacing w:after="101"/>
         <w:jc w:val="center"/>
       </w:pPr>
       <w:r>
@@ -40,7 +40,7 @@
         <w:pBdr>
           <w:bottom w:val="single" w:color="444444" w:sz="6" w:space="2"/>
         </w:pBdr>
-        <w:spacing w:after="60" w:before="170"/>
+        <w:spacing w:after="43" w:before="122"/>
       </w:pPr>
       <w:r>
         <w:rPr>
@@ -58,7 +58,7 @@
       <w:pPr>
         <w:keepNext w:val="false"/>
         <w:keepLines w:val="false"/>
-        <w:spacing w:after="80"/>
+        <w:spacing w:after="58"/>
       </w:pPr>
       <w:r>
         <w:rPr>
@@ -78,7 +78,7 @@
         <w:pBdr>
           <w:bottom w:val="single" w:color="444444" w:sz="6" w:space="2"/>
         </w:pBdr>
-        <w:spacing w:after="60" w:before="170"/>
+        <w:spacing w:after="43" w:before="122"/>
       </w:pPr>
       <w:r>
         <w:rPr>
@@ -96,7 +96,7 @@
       <w:pPr>
         <w:keepNext w:val="false"/>
         <w:keepLines w:val="false"/>
-        <w:spacing w:after="40"/>
+        <w:spacing w:after="29"/>
       </w:pPr>
       <w:r>
         <w:rPr>
@@ -114,7 +114,7 @@
       <w:pPr>
         <w:keepNext w:val="false"/>
         <w:keepLines w:val="false"/>
-        <w:spacing w:after="40"/>
+        <w:spacing w:after="29"/>
       </w:pPr>
       <w:r>
         <w:rPr>
@@ -132,7 +132,7 @@
       <w:pPr>
         <w:keepNext w:val="false"/>
         <w:keepLines w:val="false"/>
-        <w:spacing w:after="40"/>
+        <w:spacing w:after="29"/>
       </w:pPr>
       <w:r>
         <w:rPr>
@@ -150,7 +150,7 @@
       <w:pPr>
         <w:keepNext w:val="false"/>
         <w:keepLines w:val="false"/>
-        <w:spacing w:after="40"/>
+        <w:spacing w:after="29"/>
       </w:pPr>
       <w:r>
         <w:rPr>
@@ -168,7 +168,7 @@
       <w:pPr>
         <w:keepNext w:val="false"/>
         <w:keepLines w:val="false"/>
-        <w:spacing w:after="40"/>
+        <w:spacing w:after="29"/>
       </w:pPr>
       <w:r>
         <w:rPr>
@@ -186,7 +186,7 @@
       <w:pPr>
         <w:keepNext w:val="false"/>
         <w:keepLines w:val="false"/>
-        <w:spacing w:after="80"/>
+        <w:spacing w:after="58"/>
       </w:pPr>
       <w:r>
         <w:rPr>
@@ -206,7 +206,7 @@
         <w:pBdr>
           <w:bottom w:val="single" w:color="444444" w:sz="6" w:space="2"/>
         </w:pBdr>
-        <w:spacing w:after="60" w:before="170"/>
+        <w:spacing w:after="43" w:before="122"/>
       </w:pPr>
       <w:r>
         <w:rPr>
@@ -226,7 +226,7 @@
         <w:tabs>
           <w:tab w:val="right" w:pos="9360"/>
         </w:tabs>
-        <w:spacing w:after="12" w:before="95"/>
+        <w:spacing w:after="9" w:before="68"/>
       </w:pPr>
       <w:r>
         <w:rPr>
@@ -254,7 +254,7 @@
     <w:p>
       <w:pPr>
         <w:keepNext/>
-        <w:spacing w:after="40"/>
+        <w:spacing w:after="29"/>
       </w:pPr>
       <w:r>
         <w:rPr>
@@ -272,7 +272,7 @@
       <w:pPr>
         <w:keepNext w:val="false"/>
         <w:keepLines w:val="false"/>
-        <w:spacing w:after="80"/>
+        <w:spacing w:after="58"/>
       </w:pPr>
       <w:r>
         <w:rPr>
@@ -292,7 +292,7 @@
         <w:tabs>
           <w:tab w:val="right" w:pos="9360"/>
         </w:tabs>
-        <w:spacing w:after="12" w:before="95"/>
+        <w:spacing w:after="9" w:before="68"/>
       </w:pPr>
       <w:r>
         <w:rPr>
@@ -320,7 +320,7 @@
     <w:p>
       <w:pPr>
         <w:keepNext/>
-        <w:spacing w:after="40"/>
+        <w:spacing w:after="29"/>
       </w:pPr>
       <w:r>
         <w:rPr>
@@ -340,7 +340,7 @@
         <w:pBdr>
           <w:bottom w:val="single" w:color="444444" w:sz="6" w:space="2"/>
         </w:pBdr>
-        <w:spacing w:after="60" w:before="170"/>
+        <w:spacing w:after="43" w:before="122"/>
       </w:pPr>
       <w:r>
         <w:rPr>
@@ -351,7 +351,7 @@
           <w:sz w:val="22"/>
           <w:szCs w:val="22"/>
         </w:rPr>
-        <w:t xml:space="preserve">PROJECTS</w:t>
+        <w:t>CERTIFICATIONS</w:t>
       </w:r>
     </w:p>
     <w:p>
@@ -360,7 +360,76 @@
         <w:tabs>
           <w:tab w:val="right" w:pos="9360"/>
         </w:tabs>
-        <w:spacing w:after="12" w:before="95"/>
+        <w:spacing w:after="9" w:before="68"/>
+      </w:pPr>
+      <w:r>
+        <w:rPr>
+          <w:rFonts w:ascii="Calibri" w:cs="Calibri" w:eastAsia="Calibri" w:hAnsi="Calibri"/>
+          <w:b/>
+          <w:bCs/>
+          <w:color w:val="1A1A1A"/>
+          <w:sz w:val="21"/>
+          <w:szCs w:val="21"/>
+        </w:rPr>
+        <w:t>What Is Generative AI?</w:t>
+      </w:r>
+      <w:r>
+        <w:rPr>
+          <w:rFonts w:ascii="Calibri" w:cs="Calibri" w:eastAsia="Calibri" w:hAnsi="Calibri"/>
+          <w:b/>
+          <w:bCs/>
+          <w:color w:val="1A1A1A"/>
+          <w:sz w:val="21"/>
+          <w:szCs w:val="21"/>
+        </w:rPr>
+        <w:tab/>
+        <w:t>Sep 2026</w:t>
+      </w:r>
+    </w:p>
+    <w:p>
+      <w:pPr>
+        <w:keepNext/>
+        <w:spacing w:after="29"/>
+      </w:pPr>
+      <w:r>
+        <w:rPr>
+          <w:rFonts w:ascii="Calibri" w:cs="Calibri" w:eastAsia="Calibri" w:hAnsi="Calibri"/>
+          <w:i/>
+          <w:iCs/>
+          <w:color w:val="1A1A1A"/>
+          <w:sz w:val="21"/>
+          <w:szCs w:val="21"/>
+        </w:rPr>
+        <w:t>LinkedIn Learning — Course 1 of 5, Career Essentials in Generative AI by Microsoft and LinkedIn</w:t>
+      </w:r>
+    </w:p>
+    <w:p>
+      <w:pPr>
+        <w:keepNext/>
+        <w:pBdr>
+          <w:bottom w:val="single" w:color="444444" w:sz="6" w:space="2"/>
+        </w:pBdr>
+        <w:spacing w:after="43" w:before="122"/>
+      </w:pPr>
+      <w:r>
+        <w:rPr>
+          <w:rFonts w:ascii="Calibri" w:cs="Calibri" w:eastAsia="Calibri" w:hAnsi="Calibri"/>
+          <w:b/>
+          <w:bCs/>
+          <w:color w:val="1A1A1A"/>
+          <w:sz w:val="22"/>
+          <w:szCs w:val="22"/>
+        </w:rPr>
+        <w:t xml:space="preserve">PROJECTS</w:t>
+      </w:r>
+    </w:p>
+    <w:p>
+      <w:pPr>
+        <w:keepNext/>
+        <w:tabs>
+          <w:tab w:val="right" w:pos="9360"/>
+        </w:tabs>
+        <w:spacing w:after="9" w:before="68"/>
       </w:pPr>
       <w:r>
         <w:rPr>
@@ -380,7 +449,7 @@
     <w:p>
       <w:pPr>
         <w:keepNext/>
-        <w:spacing w:after="35"/>
+        <w:spacing w:after="25"/>
       </w:pPr>
       <w:r>
         <w:rPr>
@@ -401,7 +470,7 @@
           <w:ilvl w:val="0"/>
           <w:numId w:val="2"/>
         </w:numPr>
-        <w:spacing w:after="40"/>
+        <w:spacing w:after="29"/>
       </w:pPr>
       <w:r>
         <w:rPr>
@@ -420,7 +489,7 @@
           <w:ilvl w:val="0"/>
           <w:numId w:val="2"/>
         </w:numPr>
-        <w:spacing w:after="40"/>
+        <w:spacing w:after="29"/>
       </w:pPr>
       <w:r>
         <w:rPr>
@@ -439,7 +508,7 @@
           <w:ilvl w:val="0"/>
           <w:numId w:val="2"/>
         </w:numPr>
-        <w:spacing w:after="40"/>
+        <w:spacing w:after="29"/>
       </w:pPr>
       <w:r>
         <w:rPr>
@@ -457,7 +526,7 @@
         <w:tabs>
           <w:tab w:val="right" w:pos="9360"/>
         </w:tabs>
-        <w:spacing w:after="12" w:before="95"/>
+        <w:spacing w:after="9" w:before="68"/>
       </w:pPr>
       <w:r>
         <w:rPr>
@@ -477,7 +546,7 @@
     <w:p>
       <w:pPr>
         <w:keepNext/>
-        <w:spacing w:after="35"/>
+        <w:spacing w:after="25"/>
       </w:pPr>
       <w:r>
         <w:rPr>
@@ -498,7 +567,7 @@
           <w:ilvl w:val="0"/>
           <w:numId w:val="2"/>
         </w:numPr>
-        <w:spacing w:after="40"/>
+        <w:spacing w:after="29"/>
       </w:pPr>
       <w:r>
         <w:rPr>
@@ -517,7 +586,7 @@
           <w:ilvl w:val="0"/>
           <w:numId w:val="2"/>
         </w:numPr>
-        <w:spacing w:after="40"/>
+        <w:spacing w:after="29"/>
       </w:pPr>
       <w:r>
         <w:rPr>
@@ -535,7 +604,7 @@
         <w:tabs>
           <w:tab w:val="right" w:pos="9360"/>
         </w:tabs>
-        <w:spacing w:after="12" w:before="95"/>
+        <w:spacing w:after="9" w:before="68"/>
       </w:pPr>
       <w:r>
         <w:rPr>
@@ -555,7 +624,7 @@
     <w:p>
       <w:pPr>
         <w:keepNext/>
-        <w:spacing w:after="35"/>
+        <w:spacing w:after="25"/>
       </w:pPr>
       <w:r>
         <w:rPr>
@@ -576,7 +645,7 @@
           <w:ilvl w:val="0"/>
           <w:numId w:val="2"/>
         </w:numPr>
-        <w:spacing w:after="40"/>
+        <w:spacing w:after="29"/>
       </w:pPr>
       <w:r>
         <w:rPr>
@@ -595,7 +664,7 @@
           <w:ilvl w:val="0"/>
           <w:numId w:val="2"/>
         </w:numPr>
-        <w:spacing w:after="40"/>
+        <w:spacing w:after="29"/>
       </w:pPr>
       <w:r>
         <w:rPr>
@@ -613,7 +682,7 @@
         <w:tabs>
           <w:tab w:val="right" w:pos="9360"/>
         </w:tabs>
-        <w:spacing w:after="12" w:before="95"/>
+        <w:spacing w:after="9" w:before="68"/>
       </w:pPr>
       <w:r>
         <w:rPr>
@@ -633,7 +702,7 @@
     <w:p>
       <w:pPr>
         <w:keepNext/>
-        <w:spacing w:after="35"/>
+        <w:spacing w:after="25"/>
       </w:pPr>
       <w:r>
         <w:rPr>
@@ -654,7 +723,7 @@
           <w:ilvl w:val="0"/>
           <w:numId w:val="2"/>
         </w:numPr>
-        <w:spacing w:after="40"/>
+        <w:spacing w:after="29"/>
       </w:pPr>
       <w:r>
         <w:rPr>
@@ -673,7 +742,7 @@
           <w:ilvl w:val="0"/>
           <w:numId w:val="2"/>
         </w:numPr>
-        <w:spacing w:after="40"/>
+        <w:spacing w:after="29"/>
       </w:pPr>
       <w:r>
         <w:rPr>
@@ -691,7 +760,7 @@
         <w:tabs>
           <w:tab w:val="right" w:pos="9360"/>
         </w:tabs>
-        <w:spacing w:after="12" w:before="95"/>
+        <w:spacing w:after="9" w:before="68"/>
       </w:pPr>
       <w:r>
         <w:rPr>
@@ -711,7 +780,7 @@
     <w:p>
       <w:pPr>
         <w:keepNext/>
-        <w:spacing w:after="35"/>
+        <w:spacing w:after="25"/>
       </w:pPr>
       <w:r>
         <w:rPr>
@@ -732,7 +801,7 @@
           <w:ilvl w:val="0"/>
           <w:numId w:val="2"/>
         </w:numPr>
-        <w:spacing w:after="40"/>
+        <w:spacing w:after="29"/>
       </w:pPr>
       <w:r>
         <w:rPr>
@@ -750,7 +819,7 @@
         <w:tabs>
           <w:tab w:val="right" w:pos="9360"/>
         </w:tabs>
-        <w:spacing w:after="12" w:before="95"/>
+        <w:spacing w:after="9" w:before="68"/>
       </w:pPr>
       <w:r>
         <w:rPr>
@@ -770,7 +839,7 @@
     <w:p>
       <w:pPr>
         <w:keepNext/>
-        <w:spacing w:after="35"/>
+        <w:spacing w:after="25"/>
       </w:pPr>
       <w:r>
         <w:rPr>
@@ -791,7 +860,7 @@
           <w:ilvl w:val="0"/>
           <w:numId w:val="2"/>
         </w:numPr>
-        <w:spacing w:after="40"/>
+        <w:spacing w:after="29"/>
       </w:pPr>
       <w:r>
         <w:rPr>
@@ -809,7 +878,7 @@
         <w:tabs>
           <w:tab w:val="right" w:pos="9360"/>
         </w:tabs>
-        <w:spacing w:after="12" w:before="95"/>
+        <w:spacing w:after="9" w:before="68"/>
       </w:pPr>
       <w:r>
         <w:rPr>
@@ -829,7 +898,7 @@
     <w:p>
       <w:pPr>
         <w:keepNext/>
-        <w:spacing w:after="35"/>
+        <w:spacing w:after="25"/>
       </w:pPr>
       <w:r>
         <w:rPr>
@@ -850,7 +919,7 @@
           <w:ilvl w:val="0"/>
           <w:numId w:val="2"/>
         </w:numPr>
-        <w:spacing w:after="40"/>
+        <w:spacing w:after="29"/>
       </w:pPr>
       <w:r>
         <w:rPr>
@@ -868,7 +937,7 @@
         <w:tabs>
           <w:tab w:val="right" w:pos="9360"/>
         </w:tabs>
-        <w:spacing w:after="12" w:before="95"/>
+        <w:spacing w:after="9" w:before="68"/>
       </w:pPr>
       <w:r>
         <w:rPr>
@@ -888,7 +957,7 @@
     <w:p>
       <w:pPr>
         <w:keepNext/>
-        <w:spacing w:after="35"/>
+        <w:spacing w:after="25"/>
       </w:pPr>
       <w:r>
         <w:rPr>
@@ -909,7 +978,7 @@
           <w:ilvl w:val="0"/>
           <w:numId w:val="2"/>
         </w:numPr>
-        <w:spacing w:after="40"/>
+        <w:spacing w:after="29"/>
       </w:pPr>
       <w:r>
         <w:rPr>
@@ -927,7 +996,7 @@
         <w:pBdr>
           <w:bottom w:val="single" w:color="444444" w:sz="6" w:space="2"/>
         </w:pBdr>
-        <w:spacing w:after="60" w:before="170"/>
+        <w:spacing w:after="43" w:before="122"/>
       </w:pPr>
       <w:r>
         <w:rPr>
@@ -944,7 +1013,7 @@
     <w:p>
       <w:pPr>
         <w:keepNext/>
-        <w:spacing w:after="12" w:before="95"/>
+        <w:spacing w:after="9" w:before="68"/>
       </w:pPr>
       <w:r>
         <w:rPr>
@@ -964,7 +1033,7 @@
         <w:tabs>
           <w:tab w:val="right" w:pos="9360"/>
         </w:tabs>
-        <w:spacing w:after="15" w:before="60"/>
+        <w:spacing w:after="11" w:before="43"/>
       </w:pPr>
       <w:r>
         <w:rPr>
@@ -998,7 +1067,7 @@
           <w:ilvl w:val="0"/>
           <w:numId w:val="2"/>
         </w:numPr>
-        <w:spacing w:after="40"/>
+        <w:spacing w:after="29"/>
       </w:pPr>
       <w:r>
         <w:rPr>
@@ -1017,7 +1086,7 @@
           <w:ilvl w:val="0"/>
           <w:numId w:val="2"/>
         </w:numPr>
-        <w:spacing w:after="40"/>
+        <w:spacing w:after="29"/>
       </w:pPr>
       <w:r>
         <w:rPr>
@@ -1036,7 +1105,7 @@
           <w:ilvl w:val="0"/>
           <w:numId w:val="2"/>
         </w:numPr>
-        <w:spacing w:after="40"/>
+        <w:spacing w:after="29"/>
       </w:pPr>
       <w:r>
         <w:rPr>
@@ -1055,7 +1124,7 @@
           <w:ilvl w:val="0"/>
           <w:numId w:val="2"/>
         </w:numPr>
-        <w:spacing w:after="40"/>
+        <w:spacing w:after="29"/>
       </w:pPr>
       <w:r>
         <w:rPr>
@@ -1073,7 +1142,7 @@
         <w:tabs>
           <w:tab w:val="right" w:pos="9360"/>
         </w:tabs>
-        <w:spacing w:after="15" w:before="60"/>
+        <w:spacing w:after="11" w:before="43"/>
       </w:pPr>
       <w:r>
         <w:rPr>
@@ -1107,7 +1176,7 @@
           <w:ilvl w:val="0"/>
           <w:numId w:val="2"/>
         </w:numPr>
-        <w:spacing w:after="40"/>
+        <w:spacing w:after="29"/>
       </w:pPr>
       <w:r>
         <w:rPr>
@@ -1126,7 +1195,7 @@
           <w:ilvl w:val="0"/>
           <w:numId w:val="2"/>
         </w:numPr>
-        <w:spacing w:after="40"/>
+        <w:spacing w:after="29"/>
       </w:pPr>
       <w:r>
         <w:rPr>
@@ -1145,7 +1214,7 @@
           <w:ilvl w:val="0"/>
           <w:numId w:val="2"/>
         </w:numPr>
-        <w:spacing w:after="40"/>
+        <w:spacing w:after="29"/>
       </w:pPr>
       <w:r>
         <w:rPr>
@@ -1163,7 +1232,7 @@
         <w:tabs>
           <w:tab w:val="right" w:pos="9360"/>
         </w:tabs>
-        <w:spacing w:after="12" w:before="95"/>
+        <w:spacing w:after="9" w:before="68"/>
       </w:pPr>
       <w:r>
         <w:rPr>
@@ -1191,7 +1260,7 @@
     <w:p>
       <w:pPr>
         <w:keepNext/>
-        <w:spacing w:after="40"/>
+        <w:spacing w:after="29"/>
       </w:pPr>
       <w:r>
         <w:rPr>
@@ -1212,7 +1281,7 @@
           <w:ilvl w:val="0"/>
           <w:numId w:val="2"/>
         </w:numPr>
-        <w:spacing w:after="40"/>
+        <w:spacing w:after="29"/>
       </w:pPr>
       <w:r>
         <w:rPr>
@@ -1231,7 +1300,7 @@
           <w:ilvl w:val="0"/>
           <w:numId w:val="2"/>
         </w:numPr>
-        <w:spacing w:after="40"/>
+        <w:spacing w:after="29"/>
       </w:pPr>
       <w:r>
         <w:rPr>
@@ -1249,7 +1318,7 @@
         <w:tabs>
           <w:tab w:val="right" w:pos="9360"/>
         </w:tabs>
-        <w:spacing w:after="12" w:before="95"/>
+        <w:spacing w:after="9" w:before="68"/>
       </w:pPr>
       <w:r>
         <w:rPr>
@@ -1277,7 +1346,7 @@
     <w:p>
       <w:pPr>
         <w:keepNext/>
-        <w:spacing w:after="40"/>
+        <w:spacing w:after="29"/>
       </w:pPr>
       <w:r>
         <w:rPr>
@@ -1298,7 +1367,7 @@
           <w:ilvl w:val="0"/>
           <w:numId w:val="2"/>
         </w:numPr>
-        <w:spacing w:after="40"/>
+        <w:spacing w:after="29"/>
       </w:pPr>
       <w:r>
         <w:rPr>
@@ -1317,7 +1386,7 @@
           <w:ilvl w:val="0"/>
           <w:numId w:val="2"/>
         </w:numPr>
-        <w:spacing w:after="40"/>
+        <w:spacing w:after="29"/>
       </w:pPr>
       <w:r>
         <w:rPr>
@@ -1335,7 +1404,7 @@
         <w:pBdr>
           <w:bottom w:val="single" w:color="444444" w:sz="6" w:space="2"/>
         </w:pBdr>
-        <w:spacing w:after="60" w:before="170"/>
+        <w:spacing w:after="43" w:before="122"/>
       </w:pPr>
       <w:r>
         <w:rPr>
@@ -1353,7 +1422,7 @@
       <w:pPr>
         <w:keepNext w:val="false"/>
         <w:keepLines w:val="false"/>
-        <w:spacing w:after="80"/>
+        <w:spacing w:after="58"/>
       </w:pPr>
       <w:r>
         <w:rPr>
@@ -1373,7 +1442,7 @@
         <w:pBdr>
           <w:bottom w:val="single" w:color="444444" w:sz="6" w:space="2"/>
         </w:pBdr>
-        <w:spacing w:after="60" w:before="170"/>
+        <w:spacing w:after="43" w:before="122"/>
       </w:pPr>
       <w:r>
         <w:rPr>
@@ -1393,7 +1462,7 @@
         <w:tabs>
           <w:tab w:val="right" w:pos="9360"/>
         </w:tabs>
-        <w:spacing w:after="12" w:before="95"/>
+        <w:spacing w:after="9" w:before="68"/>
       </w:pPr>
       <w:r>
         <w:rPr>
@@ -1422,7 +1491,7 @@
       <w:pPr>
         <w:keepNext/>
         <w:keepLines/>
-        <w:spacing w:after="20"/>
+        <w:spacing w:after="14"/>
       </w:pPr>
       <w:r>
         <w:rPr>
@@ -1440,7 +1509,7 @@
       <w:pPr>
         <w:keepNext w:val="false"/>
         <w:keepLines w:val="false"/>
-        <w:spacing w:after="80"/>
+        <w:spacing w:after="58"/>
       </w:pPr>
       <w:r>
         <w:rPr>
@@ -1460,7 +1529,7 @@
         <w:tabs>
           <w:tab w:val="right" w:pos="9360"/>
         </w:tabs>
-        <w:spacing w:after="12" w:before="95"/>
+        <w:spacing w:after="9" w:before="68"/>
       </w:pPr>
       <w:r>
         <w:rPr>
@@ -1489,7 +1558,7 @@
       <w:pPr>
         <w:keepNext/>
         <w:keepLines/>
-        <w:spacing w:after="20"/>
+        <w:spacing w:after="14"/>
       </w:pPr>
       <w:r>
         <w:rPr>
@@ -1507,7 +1576,7 @@
       <w:pPr>
         <w:keepNext w:val="false"/>
         <w:keepLines w:val="false"/>
-        <w:spacing w:after="80"/>
+        <w:spacing w:after="58"/>
       </w:pPr>
       <w:r>
         <w:rPr>
@@ -1523,7 +1592,7 @@
     </w:p>
     <w:sectPr>
       <w:pgSz w:w="12240" w:h="15840" w:orient="portrait"/>
-      <w:pgMar w:top="560" w:right="860" w:bottom="560" w:left="860" w:header="708" w:footer="708" w:gutter="0"/>
+      <w:pgMar w:top="315" w:right="860" w:bottom="315" w:left="860" w:header="708" w:footer="708" w:gutter="0"/>
       <w:pgNumType/>
       <w:docGrid w:linePitch="360"/>
     </w:sectPr>

</xml_diff>